<commit_message>
Remove pre-launch FAQ copy now that evaluations are live in-product.
Update evaluation timing answer, drop the obsolete launch question, and refresh submission-flow spec timing.

Co-authored-by: Cursor <cursoragent@cursor.com>
</commit_message>
<xml_diff>
--- a/submission-flow-copy.docx
+++ b/submission-flow-copy.docx
@@ -97,7 +97,7 @@
         <w:spacing w:after="120"/>
       </w:pPr>
       <w:r>
-        <w:t>Drop in a manuscript. We'll run it through the rubric and return your evaluation within 48 hours.</w:t>
+        <w:t>Drop in a manuscript. We'll run it through the rubric and return your evaluation in minutes, right in your dashboard.</w:t>
       </w:r>
     </w:p>
     <w:p>
@@ -1060,7 +1060,7 @@
           <w:iCs/>
           <w:color w:val="2A3447"/>
         </w:rPr>
-        <w:t>Your evaluation is in the queue. You'll get an email when it's ready — usually within 48 hours.</w:t>
+        <w:t>Your evaluation is running now. It usually finishes in two to four minutes — keep this tab open and your dashboard will update when the read is complete.</w:t>
       </w:r>
     </w:p>
     <w:p>

</xml_diff>